<commit_message>
v22.60 release: rollback copy stays the live v22.56; Word guide with the Newport section
v22.58 and v22.60 go out together, so prev.html is the version live today
(v22.56, same as main's index.html).

Co-Authored-By: Claude Opus 5.5 <noreply@anthropic.com>
Claude-Session: https://claude.ai/code/session_01T49gnSNZq31rPRt1vHk4Rc
</commit_message>
<xml_diff>
--- a/nexidoc/Nexi_User_Guide_v22.60.docx
+++ b/nexidoc/Nexi_User_Guide_v22.60.docx
@@ -9048,6 +9048,34 @@
     <w:p>
       <w:r>
         <w:t>Leads to quotes to orders, the customers, the catalogue and the analytics over all of it.</w:t>
+      </w:r>
+    </w:p>
+    <w:p>
+      <w:pPr>
+        <w:pStyle w:val="Heading2"/>
+      </w:pPr>
+      <w:r>
+        <w:t>Newport City prospects — 49 outlets as new leads (v22.60, Eyal 12 Oct)</w:t>
+      </w:r>
+    </w:p>
+    <w:p>
+      <w:r>
+        <w:t>The Newport City prospect list of 12 Oct 2026 (Newport World Resorts, Newport Mall, the hotels — 24 priority A, 20 B, 5 C) is loaded into CRM ▸ Leads as New Leads: the outlet is the company, the contact is the buyer to find (purchasing / executive chef / F&amp;B), and the notes carry what to offer, the public phone and email (not necessarily the buyer’s), the source and the next step.</w:t>
+      </w:r>
+    </w:p>
+    <w:p>
+      <w:r>
+        <w:t>Left out: an outlet that is already a lead, and one that bought from us in the last 30 days (CRM orders, deliveries, SOS sales orders, invoices). A past customer with no purchase in 30 days is added and marked 🔁 win back.</w:t>
+      </w:r>
+    </w:p>
+    <w:p>
+      <w:r>
+        <w:t>Each new lead has one task “☎ First contact — outlet (A/B/C)” for Edelyn, shared with Eyal and Dr Amy, under one parent task “Newport City prospects — first-contact wave”. Due by priority: A in 2 working days, B in 5, C in 10 (Sunday is not counted). They show in Tasks, My Day, the Calendar and the 🤝 customer follow-up 3× a day; log each call on the lead (📞 touchpoint) and move its stage.</w:t>
+      </w:r>
+    </w:p>
+    <w:p>
+      <w:r>
+        <w:t>Outlets inside Newport World Resorts may share one purchasing team — the lead notes say so; approach them as one account first. 📥 Newport prospects in CRM ▸ Leads loads or re-checks the list: it adds only what is missing and never re-creates a lead or task the team deleted.</w:t>
       </w:r>
     </w:p>
     <w:p>

</xml_diff>